<commit_message>
test: assert unique slots, I-can criteria, label order, and drop private fixture
Add failing synthetic-fixture checks for duplicated differentiation lists,
success-criteria bands receiving tasks, Class Discussion order, and
misconceptions leaking into SEN. Point the Daily English fill test at the
synthetic fixture with generic stub text, and delete the private teacher
template from the working tree.

Co-authored-by: tashivxo <tashivxo@users.noreply.github.com>
</commit_message>
<xml_diff>
--- a/tests/fixtures/synthetic-daily-english-lesson-plan.docx
+++ b/tests/fixtures/synthetic-daily-english-lesson-plan.docx
@@ -70,6 +70,28 @@
           <w:p>
             <w:r>
               <w:t xml:space="preserve">Grade/Class</w:t>
+            </w:r>
+          </w:p>
+        </w:tc>
+        <w:tc>
+          <w:tcPr>
+            <w:tcW w:type="dxa" w:w="11859"/>
+          </w:tcPr>
+          <w:p>
+            <w:r>
+              <w:t xml:space="preserve"/>
+            </w:r>
+          </w:p>
+        </w:tc>
+      </w:tr>
+      <w:tr>
+        <w:tc>
+          <w:tcPr>
+            <w:tcW w:type="dxa" w:w="3256"/>
+          </w:tcPr>
+          <w:p>
+            <w:r>
+              <w:t xml:space="preserve">Possible Misconceptions</w:t>
             </w:r>
           </w:p>
         </w:tc>

</xml_diff>

<commit_message>
test: fail when numbered paragraphs keep typed bullets or stay empty
Numbered Adaptive and Independent Practice cells inherit numPr, so a typed
bullet glyph or a blank joinBlocks line shows as a double or empty bullet.

Co-authored-by: tashivxo <tashivxo@users.noreply.github.com>
</commit_message>
<xml_diff>
--- a/tests/fixtures/synthetic-daily-english-lesson-plan.docx
+++ b/tests/fixtures/synthetic-daily-english-lesson-plan.docx
@@ -122,33 +122,104 @@
             <w:tcW w:type="dxa" w:w="11859"/>
           </w:tcPr>
           <w:p>
+            <w:pPr>
+              <w:pStyle w:val="ListParagraph"/>
+              <w:numPr>
+                <w:ilvl w:val="0"/>
+                <w:numId w:val="2"/>
+              </w:numPr>
+            </w:pPr>
             <w:r>
               <w:t xml:space="preserve">Prior knowledge:</w:t>
             </w:r>
           </w:p>
           <w:p>
+            <w:pPr>
+              <w:pStyle w:val="ListParagraph"/>
+              <w:numPr>
+                <w:ilvl w:val="0"/>
+                <w:numId w:val="2"/>
+              </w:numPr>
+            </w:pPr>
             <w:r>
               <w:t xml:space="preserve">Working Towards Mastery (all):</w:t>
             </w:r>
           </w:p>
           <w:p>
+            <w:pPr>
+              <w:pStyle w:val="ListParagraph"/>
+              <w:numPr>
+                <w:ilvl w:val="0"/>
+                <w:numId w:val="2"/>
+              </w:numPr>
+            </w:pPr>
             <w:r>
               <w:t xml:space="preserve">Working At Mastery (most):</w:t>
             </w:r>
           </w:p>
           <w:p>
+            <w:pPr>
+              <w:pStyle w:val="ListParagraph"/>
+              <w:numPr>
+                <w:ilvl w:val="0"/>
+                <w:numId w:val="2"/>
+              </w:numPr>
+            </w:pPr>
             <w:r>
               <w:t xml:space="preserve">Mastery with Greater Depth (some):</w:t>
             </w:r>
           </w:p>
           <w:p>
+            <w:pPr>
+              <w:pStyle w:val="ListParagraph"/>
+              <w:numPr>
+                <w:ilvl w:val="0"/>
+                <w:numId w:val="2"/>
+              </w:numPr>
+            </w:pPr>
             <w:r>
               <w:t xml:space="preserve">Other adaptive teaching strategies:</w:t>
             </w:r>
           </w:p>
           <w:p>
+            <w:pPr>
+              <w:pStyle w:val="ListParagraph"/>
+              <w:numPr>
+                <w:ilvl w:val="0"/>
+                <w:numId w:val="2"/>
+              </w:numPr>
+            </w:pPr>
             <w:r>
               <w:t xml:space="preserve">Special Educational Needs (SEN registered), Learning Support (LS), Gifted &amp; Talented (G&amp;T):</w:t>
+            </w:r>
+          </w:p>
+        </w:tc>
+      </w:tr>
+      <w:tr>
+        <w:tc>
+          <w:tcPr>
+            <w:tcW w:type="dxa" w:w="3256"/>
+          </w:tcPr>
+          <w:p>
+            <w:r>
+              <w:t xml:space="preserve">Independent Practice</w:t>
+            </w:r>
+          </w:p>
+        </w:tc>
+        <w:tc>
+          <w:tcPr>
+            <w:tcW w:type="dxa" w:w="11859"/>
+          </w:tcPr>
+          <w:p>
+            <w:pPr>
+              <w:pStyle w:val="ListParagraph"/>
+              <w:numPr>
+                <w:ilvl w:val="0"/>
+                <w:numId w:val="2"/>
+              </w:numPr>
+            </w:pPr>
+            <w:r>
+              <w:t xml:space="preserve"/>
             </w:r>
           </w:p>
         </w:tc>
@@ -759,8 +830,23 @@
       </w:pPr>
     </w:lvl>
   </w:abstractNum>
+  <w:abstractNum w:abstractNumId="2" w15:restartNumberingAfterBreak="0">
+    <w:multiLevelType w:val="hybridMultilevel"/>
+    <w:lvl w:ilvl="0" w15:tentative="1">
+      <w:start w:val="1"/>
+      <w:numFmt w:val="bullet"/>
+      <w:lvlText w:val="•"/>
+      <w:lvlJc w:val="left"/>
+    </w:lvl>
+  </w:abstractNum>
   <w:num w:numId="1">
     <w:abstractNumId w:val="1"/>
+    <w:lvlOverride w:ilvl="0">
+      <w:startOverride w:val="1"/>
+    </w:lvlOverride>
+  </w:num>
+  <w:num w:numId="2">
+    <w:abstractNumId w:val="2"/>
     <w:lvlOverride w:ilvl="0">
       <w:startOverride w:val="1"/>
     </w:lvlOverride>

</xml_diff>

<commit_message>
test: require numbered strategies list and SEN/G&T without typed bullets
The double-bullet checks now assert the 6-item strategies list and SEN/G&T
lines, including standalone numbered SEN and G&T cells, not only Adaptive
mastery items.

Co-authored-by: tashivxo <tashivxo@users.noreply.github.com>
</commit_message>
<xml_diff>
--- a/tests/fixtures/synthetic-daily-english-lesson-plan.docx
+++ b/tests/fixtures/synthetic-daily-english-lesson-plan.docx
@@ -203,6 +203,64 @@
           <w:p>
             <w:r>
               <w:t xml:space="preserve">Independent Practice</w:t>
+            </w:r>
+          </w:p>
+        </w:tc>
+        <w:tc>
+          <w:tcPr>
+            <w:tcW w:type="dxa" w:w="11859"/>
+          </w:tcPr>
+          <w:p>
+            <w:pPr>
+              <w:pStyle w:val="ListParagraph"/>
+              <w:numPr>
+                <w:ilvl w:val="0"/>
+                <w:numId w:val="2"/>
+              </w:numPr>
+            </w:pPr>
+            <w:r>
+              <w:t xml:space="preserve"/>
+            </w:r>
+          </w:p>
+        </w:tc>
+      </w:tr>
+      <w:tr>
+        <w:tc>
+          <w:tcPr>
+            <w:tcW w:type="dxa" w:w="3256"/>
+          </w:tcPr>
+          <w:p>
+            <w:r>
+              <w:t xml:space="preserve">SEN</w:t>
+            </w:r>
+          </w:p>
+        </w:tc>
+        <w:tc>
+          <w:tcPr>
+            <w:tcW w:type="dxa" w:w="11859"/>
+          </w:tcPr>
+          <w:p>
+            <w:pPr>
+              <w:pStyle w:val="ListParagraph"/>
+              <w:numPr>
+                <w:ilvl w:val="0"/>
+                <w:numId w:val="2"/>
+              </w:numPr>
+            </w:pPr>
+            <w:r>
+              <w:t xml:space="preserve"/>
+            </w:r>
+          </w:p>
+        </w:tc>
+      </w:tr>
+      <w:tr>
+        <w:tc>
+          <w:tcPr>
+            <w:tcW w:type="dxa" w:w="3256"/>
+          </w:tcPr>
+          <w:p>
+            <w:r>
+              <w:t xml:space="preserve">G&amp;T</w:t>
             </w:r>
           </w:p>
         </w:tc>

</xml_diff>